<commit_message>
Statuto e regolamento 1.1: tesseramento spostato nel regolamento
Co-Authored-By: Claude Opus 5.5 <noreply@anthropic.com>
Claude-Session: https://claude.ai/code/session_01Sfc7e99uvPwL46pV3DVmkv
</commit_message>
<xml_diff>
--- a/docs/statuto/BAS-regolamento_interno-v.1.1.docx
+++ b/docs/statuto/BAS-regolamento_interno-v.1.1.docx
@@ -274,7 +274,7 @@
               <w:fldChar w:fldCharType="begin"/>
               <w:instrText xml:space="preserve"> PAGEREF _Toc900005004 \h </w:instrText>
               <w:fldChar w:fldCharType="separate"/>
-              <w:t>3</w:t>
+              <w:t>4</w:t>
               <w:fldChar w:fldCharType="end"/>
             </w:r>
           </w:hyperlink>
@@ -418,7 +418,7 @@
               <w:fldChar w:fldCharType="begin"/>
               <w:instrText xml:space="preserve"> PAGEREF _Toc900005008 \h </w:instrText>
               <w:fldChar w:fldCharType="separate"/>
-              <w:t>4</w:t>
+              <w:t>5</w:t>
               <w:fldChar w:fldCharType="end"/>
             </w:r>
           </w:hyperlink>
@@ -488,7 +488,7 @@
               <w:fldChar w:fldCharType="begin"/>
               <w:instrText xml:space="preserve"> PAGEREF _Toc900005010 \h </w:instrText>
               <w:fldChar w:fldCharType="separate"/>
-              <w:t>5</w:t>
+              <w:t>6</w:t>
               <w:fldChar w:fldCharType="end"/>
             </w:r>
           </w:hyperlink>
@@ -597,7 +597,7 @@
               <w:fldChar w:fldCharType="begin"/>
               <w:instrText xml:space="preserve"> PAGEREF _Toc900005013 \h </w:instrText>
               <w:fldChar w:fldCharType="separate"/>
-              <w:t>6</w:t>
+              <w:t>7</w:t>
               <w:fldChar w:fldCharType="end"/>
             </w:r>
           </w:hyperlink>
@@ -1880,7 +1880,29 @@
               <w:rPr>
                 <w:rFonts w:asciiTheme="majorHAnsi" w:hAnsiTheme="majorHAnsi" w:cstheme="majorHAnsi"/>
               </w:rPr>
-              <w:t xml:space="preserve">Il campo di tiro "Franco Cortignani", sito in località Macchietto, Viceno (Castel Viscardo), è accessibile esclusivamente ai soci e ai tesserati in regola con il tesseramento sociale e federale per l'anno in corso (statuto, art. 2, comma 4).</w:t>
+              <w:t xml:space="preserve">Il campo di tiro "Franco Cortignani", sito in località Macchietto, Viceno (Castel Viscardo), è accessibile esclusivamente ai soci e ai tesserati in regola con il tesseramento all'ente di affiliazione (statuto, art. 2, comma 4).</w:t>
+            </w:r>
+          </w:p>
+          <w:p>
+            <w:pPr>
+              <w:pBdr>
+                <w:top w:val="nil"/>
+                <w:left w:val="nil"/>
+                <w:bottom w:val="nil"/>
+                <w:right w:val="nil"/>
+                <w:between w:val="nil"/>
+              </w:pBdr>
+              <w:spacing w:after="0"/>
+              <w:jc w:val="both"/>
+              <w:rPr>
+                <w:rFonts w:asciiTheme="majorHAnsi" w:hAnsiTheme="majorHAnsi" w:cstheme="majorHAnsi"/>
+              </w:rPr>
+            </w:pPr>
+            <w:r>
+              <w:rPr>
+                <w:rFonts w:asciiTheme="majorHAnsi" w:hAnsiTheme="majorHAnsi" w:cstheme="majorHAnsi"/>
+              </w:rPr>
+              <w:t xml:space="preserve">La partecipazione a qualsiasi attività associativa, agonistica, didattica e promozionale all'interno degli impianti e delle aree in gestione all'Associazione, comprese le gare e le manifestazioni aperte a partecipanti esterni, è subordinata al preventivo tesseramento all'ente di affiliazione, anche nella forma giornaliera ove prevista.</w:t>
             </w:r>
           </w:p>
         </w:tc>

</xml_diff>

<commit_message>
Statuto e regolamento 1.1: rilettura di Paolo (RASD facoltativo, consultazione telematica nel regolamento)
Co-Authored-By: Claude Opus 5.5 <noreply@anthropic.com>
Claude-Session: https://claude.ai/code/session_01Sfc7e99uvPwL46pV3DVmkv
</commit_message>
<xml_diff>
--- a/docs/statuto/BAS-regolamento_interno-v.1.1.docx
+++ b/docs/statuto/BAS-regolamento_interno-v.1.1.docx
@@ -916,7 +916,7 @@
               <w:fldChar w:fldCharType="begin"/>
               <w:instrText xml:space="preserve"> PAGEREF _Toc900005022 \h </w:instrText>
               <w:fldChar w:fldCharType="separate"/>
-              <w:t>10</w:t>
+              <w:t>11</w:t>
               <w:fldChar w:fldCharType="end"/>
             </w:r>
           </w:hyperlink>
@@ -951,7 +951,7 @@
               <w:fldChar w:fldCharType="begin"/>
               <w:instrText xml:space="preserve"> PAGEREF _Toc900005023 \h </w:instrText>
               <w:fldChar w:fldCharType="separate"/>
-              <w:t>10</w:t>
+              <w:t>11</w:t>
               <w:fldChar w:fldCharType="end"/>
             </w:r>
           </w:hyperlink>
@@ -986,7 +986,7 @@
               <w:fldChar w:fldCharType="begin"/>
               <w:instrText xml:space="preserve"> PAGEREF _Toc900005024 \h </w:instrText>
               <w:fldChar w:fldCharType="separate"/>
-              <w:t>11</w:t>
+              <w:t>12</w:t>
               <w:fldChar w:fldCharType="end"/>
             </w:r>
           </w:hyperlink>
@@ -1021,7 +1021,7 @@
               <w:fldChar w:fldCharType="begin"/>
               <w:instrText xml:space="preserve"> PAGEREF _Toc900005025 \h </w:instrText>
               <w:fldChar w:fldCharType="separate"/>
-              <w:t>11</w:t>
+              <w:t>12</w:t>
               <w:fldChar w:fldCharType="end"/>
             </w:r>
           </w:hyperlink>
@@ -1056,7 +1056,7 @@
               <w:fldChar w:fldCharType="begin"/>
               <w:instrText xml:space="preserve"> PAGEREF _Toc900005026 \h </w:instrText>
               <w:fldChar w:fldCharType="separate"/>
-              <w:t>11</w:t>
+              <w:t>12</w:t>
               <w:fldChar w:fldCharType="end"/>
             </w:r>
           </w:hyperlink>
@@ -1091,7 +1091,7 @@
               <w:fldChar w:fldCharType="begin"/>
               <w:instrText xml:space="preserve"> PAGEREF _Toc900005027 \h </w:instrText>
               <w:fldChar w:fldCharType="separate"/>
-              <w:t>11</w:t>
+              <w:t>12</w:t>
               <w:fldChar w:fldCharType="end"/>
             </w:r>
           </w:hyperlink>
@@ -1130,7 +1130,7 @@
               <w:fldChar w:fldCharType="begin"/>
               <w:instrText xml:space="preserve"> PAGEREF _Toc900005028 \h </w:instrText>
               <w:fldChar w:fldCharType="separate"/>
-              <w:t>12</w:t>
+              <w:t>13</w:t>
               <w:fldChar w:fldCharType="end"/>
             </w:r>
           </w:hyperlink>
@@ -1165,7 +1165,7 @@
               <w:fldChar w:fldCharType="begin"/>
               <w:instrText xml:space="preserve"> PAGEREF _Toc900005029 \h </w:instrText>
               <w:fldChar w:fldCharType="separate"/>
-              <w:t>12</w:t>
+              <w:t>13</w:t>
               <w:fldChar w:fldCharType="end"/>
             </w:r>
           </w:hyperlink>
@@ -1200,7 +1200,7 @@
               <w:fldChar w:fldCharType="begin"/>
               <w:instrText xml:space="preserve"> PAGEREF _Toc900005030 \h </w:instrText>
               <w:fldChar w:fldCharType="separate"/>
-              <w:t>12</w:t>
+              <w:t>13</w:t>
               <w:fldChar w:fldCharType="end"/>
             </w:r>
           </w:hyperlink>
@@ -1235,7 +1235,7 @@
               <w:fldChar w:fldCharType="begin"/>
               <w:instrText xml:space="preserve"> PAGEREF _Toc900005031 \h </w:instrText>
               <w:fldChar w:fldCharType="separate"/>
-              <w:t>13</w:t>
+              <w:t>14</w:t>
               <w:fldChar w:fldCharType="end"/>
             </w:r>
           </w:hyperlink>
@@ -1270,7 +1270,7 @@
               <w:fldChar w:fldCharType="begin"/>
               <w:instrText xml:space="preserve"> PAGEREF _Toc900005032 \h </w:instrText>
               <w:fldChar w:fldCharType="separate"/>
-              <w:t>13</w:t>
+              <w:t>14</w:t>
               <w:fldChar w:fldCharType="end"/>
             </w:r>
           </w:hyperlink>
@@ -1309,7 +1309,7 @@
               <w:fldChar w:fldCharType="begin"/>
               <w:instrText xml:space="preserve"> PAGEREF _Toc900005033 \h </w:instrText>
               <w:fldChar w:fldCharType="separate"/>
-              <w:t>13</w:t>
+              <w:t>14</w:t>
               <w:fldChar w:fldCharType="end"/>
             </w:r>
           </w:hyperlink>
@@ -1344,7 +1344,7 @@
               <w:fldChar w:fldCharType="begin"/>
               <w:instrText xml:space="preserve"> PAGEREF _Toc900005034 \h </w:instrText>
               <w:fldChar w:fldCharType="separate"/>
-              <w:t>13</w:t>
+              <w:t>14</w:t>
               <w:fldChar w:fldCharType="end"/>
             </w:r>
           </w:hyperlink>
@@ -1379,7 +1379,7 @@
               <w:fldChar w:fldCharType="begin"/>
               <w:instrText xml:space="preserve"> PAGEREF _Toc900005035 \h </w:instrText>
               <w:fldChar w:fldCharType="separate"/>
-              <w:t>14</w:t>
+              <w:t>15</w:t>
               <w:fldChar w:fldCharType="end"/>
             </w:r>
           </w:hyperlink>
@@ -1418,7 +1418,7 @@
               <w:fldChar w:fldCharType="begin"/>
               <w:instrText xml:space="preserve"> PAGEREF _Toc900005036 \h </w:instrText>
               <w:fldChar w:fldCharType="separate"/>
-              <w:t>14</w:t>
+              <w:t>15</w:t>
               <w:fldChar w:fldCharType="end"/>
             </w:r>
           </w:hyperlink>
@@ -1453,7 +1453,7 @@
               <w:fldChar w:fldCharType="begin"/>
               <w:instrText xml:space="preserve"> PAGEREF _Toc900005037 \h </w:instrText>
               <w:fldChar w:fldCharType="separate"/>
-              <w:t>14</w:t>
+              <w:t>15</w:t>
               <w:fldChar w:fldCharType="end"/>
             </w:r>
           </w:hyperlink>
@@ -1488,7 +1488,7 @@
               <w:fldChar w:fldCharType="begin"/>
               <w:instrText xml:space="preserve"> PAGEREF _Toc900005038 \h </w:instrText>
               <w:fldChar w:fldCharType="separate"/>
-              <w:t>14</w:t>
+              <w:t>15</w:t>
               <w:fldChar w:fldCharType="end"/>
             </w:r>
           </w:hyperlink>
@@ -1523,7 +1523,7 @@
               <w:fldChar w:fldCharType="begin"/>
               <w:instrText xml:space="preserve"> PAGEREF _Toc900005039 \h </w:instrText>
               <w:fldChar w:fldCharType="separate"/>
-              <w:t>15</w:t>
+              <w:t>16</w:t>
               <w:fldChar w:fldCharType="end"/>
             </w:r>
           </w:hyperlink>
@@ -1558,7 +1558,7 @@
               <w:fldChar w:fldCharType="begin"/>
               <w:instrText xml:space="preserve"> PAGEREF _Toc900005040 \h </w:instrText>
               <w:fldChar w:fldCharType="separate"/>
-              <w:t>15</w:t>
+              <w:t>16</w:t>
               <w:fldChar w:fldCharType="end"/>
             </w:r>
           </w:hyperlink>
@@ -1597,7 +1597,7 @@
               <w:fldChar w:fldCharType="begin"/>
               <w:instrText xml:space="preserve"> PAGEREF _Toc900005041 \h </w:instrText>
               <w:fldChar w:fldCharType="separate"/>
-              <w:t>15</w:t>
+              <w:t>16</w:t>
               <w:fldChar w:fldCharType="end"/>
             </w:r>
           </w:hyperlink>
@@ -1632,7 +1632,7 @@
               <w:fldChar w:fldCharType="begin"/>
               <w:instrText xml:space="preserve"> PAGEREF _Toc900005042 \h </w:instrText>
               <w:fldChar w:fldCharType="separate"/>
-              <w:t>15</w:t>
+              <w:t>16</w:t>
               <w:fldChar w:fldCharType="end"/>
             </w:r>
           </w:hyperlink>
@@ -1667,7 +1667,7 @@
               <w:fldChar w:fldCharType="begin"/>
               <w:instrText xml:space="preserve"> PAGEREF _Toc900005043 \h </w:instrText>
               <w:fldChar w:fldCharType="separate"/>
-              <w:t>16</w:t>
+              <w:t>17</w:t>
               <w:fldChar w:fldCharType="end"/>
             </w:r>
           </w:hyperlink>
@@ -1706,7 +1706,7 @@
               <w:fldChar w:fldCharType="begin"/>
               <w:instrText xml:space="preserve"> PAGEREF _Toc900005044 \h </w:instrText>
               <w:fldChar w:fldCharType="separate"/>
-              <w:t>16</w:t>
+              <w:t>17</w:t>
               <w:fldChar w:fldCharType="end"/>
             </w:r>
           </w:hyperlink>
@@ -5453,7 +5453,51 @@
               <w:rPr>
                 <w:rFonts w:asciiTheme="majorHAnsi" w:hAnsiTheme="majorHAnsi" w:cstheme="majorHAnsi"/>
               </w:rPr>
-              <w:t xml:space="preserve">La proposta di delibera può essere preparata dal Segretario; la consultazione è avviata dal Presidente o, in caso di sua assenza o impedimento, dal Vicepresidente. Ogni consigliere riceve un collegamento personale e non cedibile e può votare favorevole, contrario, astenuto o chiedere la discussione in riunione. Il sistema registra data, ora e identificativo del collegamento di ogni voto. Alla chiusura il verbale è redatto con il voto di ciascuno (statuto, art. 17, commi 4–6).</w:t>
+              <w:t xml:space="preserve">La proposta di delibera può essere preparata dal Segretario; la consultazione è avviata dal Presidente o, in caso di sua assenza o impedimento, dal Vicepresidente (statuto, art. 17, comma 4).</w:t>
+            </w:r>
+          </w:p>
+          <w:p>
+            <w:pPr>
+              <w:pBdr>
+                <w:top w:val="nil"/>
+                <w:left w:val="nil"/>
+                <w:bottom w:val="nil"/>
+                <w:right w:val="nil"/>
+                <w:between w:val="nil"/>
+              </w:pBdr>
+              <w:spacing w:after="0"/>
+              <w:jc w:val="both"/>
+              <w:rPr>
+                <w:rFonts w:asciiTheme="majorHAnsi" w:hAnsiTheme="majorHAnsi" w:cstheme="majorHAnsi"/>
+              </w:rPr>
+            </w:pPr>
+            <w:r>
+              <w:rPr>
+                <w:rFonts w:asciiTheme="majorHAnsi" w:hAnsiTheme="majorHAnsi" w:cstheme="majorHAnsi"/>
+              </w:rPr>
+              <w:t xml:space="preserve">Ogni consigliere riceve all'indirizzo di posta elettronica registrato la proposta di delibera, la documentazione e un collegamento personale e non cedibile, con il quale vota favorevole, contrario o astenuto, oppure chiede la discussione in riunione. Il termine per votare è indicato nella proposta e non è inferiore a tre giorni; per l'ammissione di nuovi soci è quello dell'art. 6, comma 3, dello statuto. Il voto contrario all'ammissione di un nuovo socio è motivato.</w:t>
+            </w:r>
+          </w:p>
+          <w:p>
+            <w:pPr>
+              <w:pBdr>
+                <w:top w:val="nil"/>
+                <w:left w:val="nil"/>
+                <w:bottom w:val="nil"/>
+                <w:right w:val="nil"/>
+                <w:between w:val="nil"/>
+              </w:pBdr>
+              <w:spacing w:after="0"/>
+              <w:jc w:val="both"/>
+              <w:rPr>
+                <w:rFonts w:asciiTheme="majorHAnsi" w:hAnsiTheme="majorHAnsi" w:cstheme="majorHAnsi"/>
+              </w:rPr>
+            </w:pPr>
+            <w:r>
+              <w:rPr>
+                <w:rFonts w:asciiTheme="majorHAnsi" w:hAnsiTheme="majorHAnsi" w:cstheme="majorHAnsi"/>
+              </w:rPr>
+              <w:t xml:space="preserve">La consultazione si chiude alla scadenza del termine, oppure prima quando tutti hanno votato o quando un terzo dei consiglieri ha chiesto la discussione in riunione. Per ogni voto sono registrati data, ora e identificativo del collegamento usato. Alla chiusura il verbale è redatto con il voto di ciascun consigliere (statuto, art. 17, commi 4–6).</w:t>
             </w:r>
           </w:p>
         </w:tc>

</xml_diff>